<commit_message>
Update resume DOCX with corrected Disney info (rewards & quests, metaverse, 360 guest platform)
</commit_message>
<xml_diff>
--- a/Walter_Colindres_Resume_GeniusSports.docx
+++ b/Walter_Colindres_Resume_GeniusSports.docx
@@ -290,10 +290,7 @@
         <w:spacing w:after="40"/>
       </w:pPr>
       <w:r>
-        <w:rPr>
-          <w:b w:val="0"/>
-        </w:rPr>
-        <w:t>Owned product strategy and execution for consumer-facing digital experiences serving millions of users.</w:t>
+        <w:t>Owned product strategy and execution for next-generation storytelling for the metaverse — building a unified platform connecting all Disney properties and guest data into a single 360-degree guest profile to drive engagement and sales across the entire Disney ecosystem.</w:t>
       </w:r>
     </w:p>
     <w:p>
@@ -302,16 +299,7 @@
         <w:spacing w:after="40" w:before="0"/>
       </w:pPr>
       <w:r>
-        <w:t>Defined and drove product roadmap for high-traffic digital properties serving millions of users across Disney's entertainment ecosystem</w:t>
-      </w:r>
-    </w:p>
-    <w:p>
-      <w:pPr>
-        <w:pStyle w:val="ListBullet"/>
-        <w:spacing w:after="40" w:before="0"/>
-      </w:pPr>
-      <w:r>
-        <w:t>Led product strategy for rewards and quests programs engaging millions of users; partnered with engineering and design to ship intuitive, user-first experiences</w:t>
+        <w:t>Led the rewards and quests portions of the platform — designing experiences that would have powered the world's largest loyalty program, connecting parks, streaming, retail, and physical experiences into one guest layer for personalized rewards, content, and commerce</w:t>
       </w:r>
     </w:p>
     <w:p>
@@ -329,7 +317,7 @@
         <w:spacing w:after="40" w:before="0"/>
       </w:pPr>
       <w:r>
-        <w:t>Partnered with engineering, design, and business stakeholders to ship feature releases that improved engagement and retention across web and mobile platforms</w:t>
+        <w:t>Partnered with engineering, design, and data science on recommendation architecture and personalized content delivery across business units</w:t>
       </w:r>
     </w:p>
     <w:p>
@@ -339,6 +327,15 @@
       </w:pPr>
       <w:r>
         <w:t>Established lean and agile practices, performance metrics, and reporting cadences that aligned cross-functional teams on shared outcomes</w:t>
+      </w:r>
+    </w:p>
+    <w:p>
+      <w:pPr>
+        <w:pStyle w:val="ListBullet"/>
+        <w:spacing w:after="40" w:before="0"/>
+      </w:pPr>
+      <w:r>
+        <w:t>Strategic RIF.</w:t>
       </w:r>
     </w:p>
     <w:p>

</xml_diff>

<commit_message>
Remove 3 incorrect Disney bullets from resume (keep metaverse + rewards/quests + RIF)
</commit_message>
<xml_diff>
--- a/Walter_Colindres_Resume_GeniusSports.docx
+++ b/Walter_Colindres_Resume_GeniusSports.docx
@@ -300,33 +300,6 @@
       </w:pPr>
       <w:r>
         <w:t>Led the rewards and quests portions of the platform — designing experiences that would have powered the world's largest loyalty program, connecting parks, streaming, retail, and physical experiences into one guest layer for personalized rewards, content, and commerce</w:t>
-      </w:r>
-    </w:p>
-    <w:p>
-      <w:pPr>
-        <w:pStyle w:val="ListBullet"/>
-        <w:spacing w:after="40" w:before="0"/>
-      </w:pPr>
-      <w:r>
-        <w:t>Managed 5 PMs, providing backlog grooming, sprint planning, and prioritization guidance across the product portfolio</w:t>
-      </w:r>
-    </w:p>
-    <w:p>
-      <w:pPr>
-        <w:pStyle w:val="ListBullet"/>
-        <w:spacing w:after="40" w:before="0"/>
-      </w:pPr>
-      <w:r>
-        <w:t>Partnered with engineering, design, and data science on recommendation architecture and personalized content delivery across business units</w:t>
-      </w:r>
-    </w:p>
-    <w:p>
-      <w:pPr>
-        <w:pStyle w:val="ListBullet"/>
-        <w:spacing w:after="40" w:before="0"/>
-      </w:pPr>
-      <w:r>
-        <w:t>Established lean and agile practices, performance metrics, and reporting cadences that aligned cross-functional teams on shared outcomes</w:t>
       </w:r>
     </w:p>
     <w:p>

</xml_diff>